<commit_message>
chore: add member table
</commit_message>
<xml_diff>
--- a/docs/524H0003_NguyenVietAnh.docx
+++ b/docs/524H0003_NguyenVietAnh.docx
@@ -2,6 +2,318 @@
 <file path=word/document.xml><?xml version="1.0" encoding="utf-8"?>
 <w:document xmlns:wpc="http://schemas.microsoft.com/office/word/2010/wordprocessingCanvas" xmlns:cx="http://schemas.microsoft.com/office/drawing/2014/chartex" xmlns:cx1="http://schemas.microsoft.com/office/drawing/2015/9/8/chartex" xmlns:cx2="http://schemas.microsoft.com/office/drawing/2015/10/21/chartex" xmlns:cx3="http://schemas.microsoft.com/office/drawing/2016/5/9/chartex" xmlns:cx4="http://schemas.microsoft.com/office/drawing/2016/5/10/chartex" xmlns:cx5="http://schemas.microsoft.com/office/drawing/2016/5/11/chartex" xmlns:cx6="http://schemas.microsoft.com/office/drawing/2016/5/12/chartex" xmlns:cx7="http://schemas.microsoft.com/office/drawing/2016/5/13/chartex" xmlns:cx8="http://schemas.microsoft.com/office/drawing/2016/5/14/chartex" xmlns:mc="http://schemas.openxmlformats.org/markup-compatibility/2006" xmlns:aink="http://schemas.microsoft.com/office/drawing/2016/ink" xmlns:am3d="http://schemas.microsoft.com/office/drawing/2017/model3d" xmlns:o="urn:schemas-microsoft-com:office:office" xmlns:oel="http://schemas.microsoft.com/office/2019/extlst" xmlns:r="http://schemas.openxmlformats.org/officeDocument/2006/relationships" xmlns:m="http://schemas.openxmlformats.org/officeDocument/2006/math" xmlns:v="urn:schemas-microsoft-com:vml" xmlns:wp14="http://schemas.microsoft.com/office/word/2010/wordprocessingDrawing" xmlns:wp="http://schemas.openxmlformats.org/drawingml/2006/wordprocessingDrawing" xmlns:w10="urn:schemas-microsoft-com:office:word" xmlns:w="http://schemas.openxmlformats.org/wordprocessingml/2006/main" xmlns:w14="http://schemas.microsoft.com/office/word/2010/wordml" xmlns:w15="http://schemas.microsoft.com/office/word/2012/wordml" xmlns:w16cex="http://schemas.microsoft.com/office/word/2018/wordml/cex" xmlns:w16cid="http://schemas.microsoft.com/office/word/2016/wordml/cid" xmlns:w16="http://schemas.microsoft.com/office/word/2018/wordml" xmlns:w16sdtdh="http://schemas.microsoft.com/office/word/2020/wordml/sdtdatahash" xmlns:w16se="http://schemas.microsoft.com/office/word/2015/wordml/symex" xmlns:wpg="http://schemas.microsoft.com/office/word/2010/wordprocessingGroup" xmlns:wpi="http://schemas.microsoft.com/office/word/2010/wordprocessingInk" xmlns:wne="http://schemas.microsoft.com/office/word/2006/wordml" xmlns:wps="http://schemas.microsoft.com/office/word/2010/wordprocessingShape" mc:Ignorable="w14 w15 w16se w16cid w16 w16cex w16sdtdh wp14">
   <w:body>
+    <w:tbl>
+      <w:tblPr>
+        <w:tblStyle w:val="TableGrid"/>
+        <w:tblW w:w="0" w:type="auto"/>
+        <w:tblLook w:val="04A0" w:firstRow="1" w:lastRow="0" w:firstColumn="1" w:lastColumn="0" w:noHBand="0" w:noVBand="1"/>
+      </w:tblPr>
+      <w:tblGrid>
+        <w:gridCol w:w="3116"/>
+        <w:gridCol w:w="3117"/>
+        <w:gridCol w:w="3117"/>
+      </w:tblGrid>
+      <w:tr>
+        <w:tc>
+          <w:tcPr>
+            <w:tcW w:w="3116" w:type="dxa"/>
+          </w:tcPr>
+          <w:p>
+            <w:pPr>
+              <w:keepNext/>
+            </w:pPr>
+            <w:r>
+              <w:rPr>
+                <w:lang w:val="en-US"/>
+              </w:rPr>
+              <w:t>Số</w:t>
+            </w:r>
+            <w:r>
+              <w:t xml:space="preserve"> thứ tự thành viên</w:t>
+            </w:r>
+          </w:p>
+        </w:tc>
+        <w:tc>
+          <w:tcPr>
+            <w:tcW w:w="3117" w:type="dxa"/>
+          </w:tcPr>
+          <w:p>
+            <w:pPr>
+              <w:keepNext/>
+            </w:pPr>
+            <w:r>
+              <w:rPr>
+                <w:lang w:val="en-US"/>
+              </w:rPr>
+              <w:t>Họ</w:t>
+            </w:r>
+            <w:r>
+              <w:t xml:space="preserve"> và Tên</w:t>
+            </w:r>
+          </w:p>
+        </w:tc>
+        <w:tc>
+          <w:tcPr>
+            <w:tcW w:w="3117" w:type="dxa"/>
+          </w:tcPr>
+          <w:p>
+            <w:pPr>
+              <w:keepNext/>
+            </w:pPr>
+            <w:r>
+              <w:rPr>
+                <w:lang w:val="en-US"/>
+              </w:rPr>
+              <w:t>Mã</w:t>
+            </w:r>
+            <w:r>
+              <w:t xml:space="preserve"> số sinh viên</w:t>
+            </w:r>
+          </w:p>
+        </w:tc>
+      </w:tr>
+      <w:tr>
+        <w:tc>
+          <w:tcPr>
+            <w:tcW w:w="3116" w:type="dxa"/>
+          </w:tcPr>
+          <w:p>
+            <w:pPr>
+              <w:keepNext/>
+              <w:rPr>
+                <w:lang w:val="en-US"/>
+              </w:rPr>
+            </w:pPr>
+            <w:r>
+              <w:rPr>
+                <w:lang w:val="en-US"/>
+              </w:rPr>
+              <w:t>1</w:t>
+            </w:r>
+          </w:p>
+        </w:tc>
+        <w:tc>
+          <w:tcPr>
+            <w:tcW w:w="3117" w:type="dxa"/>
+          </w:tcPr>
+          <w:p>
+            <w:pPr>
+              <w:keepNext/>
+            </w:pPr>
+            <w:r>
+              <w:rPr>
+                <w:lang w:val="en-US"/>
+              </w:rPr>
+              <w:t>Nguyễn</w:t>
+            </w:r>
+            <w:r>
+              <w:t xml:space="preserve"> Việt Anh</w:t>
+            </w:r>
+          </w:p>
+        </w:tc>
+        <w:tc>
+          <w:tcPr>
+            <w:tcW w:w="3117" w:type="dxa"/>
+          </w:tcPr>
+          <w:p>
+            <w:pPr>
+              <w:keepNext/>
+              <w:rPr>
+                <w:lang w:val="en-US"/>
+              </w:rPr>
+            </w:pPr>
+            <w:r>
+              <w:rPr>
+                <w:lang w:val="en-US"/>
+              </w:rPr>
+              <w:t>524H0003</w:t>
+            </w:r>
+          </w:p>
+        </w:tc>
+      </w:tr>
+      <w:tr>
+        <w:tc>
+          <w:tcPr>
+            <w:tcW w:w="3116" w:type="dxa"/>
+          </w:tcPr>
+          <w:p>
+            <w:pPr>
+              <w:keepNext/>
+              <w:rPr>
+                <w:lang w:val="en-US"/>
+              </w:rPr>
+            </w:pPr>
+            <w:r>
+              <w:rPr>
+                <w:lang w:val="en-US"/>
+              </w:rPr>
+              <w:t>2</w:t>
+            </w:r>
+          </w:p>
+        </w:tc>
+        <w:tc>
+          <w:tcPr>
+            <w:tcW w:w="3117" w:type="dxa"/>
+          </w:tcPr>
+          <w:p>
+            <w:pPr>
+              <w:keepNext/>
+            </w:pPr>
+            <w:r>
+              <w:rPr>
+                <w:lang w:val="en-US"/>
+              </w:rPr>
+              <w:t>Trần</w:t>
+            </w:r>
+            <w:r>
+              <w:t xml:space="preserve"> Hữu Danh</w:t>
+            </w:r>
+          </w:p>
+        </w:tc>
+        <w:tc>
+          <w:tcPr>
+            <w:tcW w:w="3117" w:type="dxa"/>
+          </w:tcPr>
+          <w:p>
+            <w:pPr>
+              <w:keepNext/>
+            </w:pPr>
+            <w:r>
+              <w:rPr>
+                <w:lang w:val="en-US"/>
+              </w:rPr>
+              <w:t>524H0007</w:t>
+            </w:r>
+          </w:p>
+        </w:tc>
+      </w:tr>
+      <w:tr>
+        <w:tc>
+          <w:tcPr>
+            <w:tcW w:w="3116" w:type="dxa"/>
+          </w:tcPr>
+          <w:p>
+            <w:pPr>
+              <w:keepNext/>
+              <w:rPr>
+                <w:lang w:val="en-US"/>
+              </w:rPr>
+            </w:pPr>
+            <w:r>
+              <w:rPr>
+                <w:lang w:val="en-US"/>
+              </w:rPr>
+              <w:t>3</w:t>
+            </w:r>
+          </w:p>
+        </w:tc>
+        <w:tc>
+          <w:tcPr>
+            <w:tcW w:w="3117" w:type="dxa"/>
+          </w:tcPr>
+          <w:p>
+            <w:pPr>
+              <w:keepNext/>
+            </w:pPr>
+            <w:r>
+              <w:rPr>
+                <w:lang w:val="en-US"/>
+              </w:rPr>
+              <w:t>Lâm</w:t>
+            </w:r>
+            <w:r>
+              <w:t xml:space="preserve"> Vĩ Hoằng</w:t>
+            </w:r>
+          </w:p>
+        </w:tc>
+        <w:tc>
+          <w:tcPr>
+            <w:tcW w:w="3117" w:type="dxa"/>
+          </w:tcPr>
+          <w:p>
+            <w:pPr>
+              <w:keepNext/>
+              <w:rPr>
+                <w:lang w:val="en-US"/>
+              </w:rPr>
+            </w:pPr>
+            <w:r>
+              <w:rPr>
+                <w:lang w:val="en-US"/>
+              </w:rPr>
+              <w:t>524H0088</w:t>
+            </w:r>
+          </w:p>
+        </w:tc>
+      </w:tr>
+      <w:tr>
+        <w:tc>
+          <w:tcPr>
+            <w:tcW w:w="3116" w:type="dxa"/>
+          </w:tcPr>
+          <w:p>
+            <w:pPr>
+              <w:keepNext/>
+              <w:rPr>
+                <w:lang w:val="en-US"/>
+              </w:rPr>
+            </w:pPr>
+            <w:r>
+              <w:rPr>
+                <w:lang w:val="en-US"/>
+              </w:rPr>
+              <w:t>4</w:t>
+            </w:r>
+          </w:p>
+        </w:tc>
+        <w:tc>
+          <w:tcPr>
+            <w:tcW w:w="3117" w:type="dxa"/>
+          </w:tcPr>
+          <w:p>
+            <w:pPr>
+              <w:keepNext/>
+            </w:pPr>
+            <w:r>
+              <w:rPr>
+                <w:lang w:val="en-US"/>
+              </w:rPr>
+              <w:t>Tạ</w:t>
+            </w:r>
+            <w:r>
+              <w:t xml:space="preserve"> Nguyễn Thành Quý</w:t>
+            </w:r>
+          </w:p>
+        </w:tc>
+        <w:tc>
+          <w:tcPr>
+            <w:tcW w:w="3117" w:type="dxa"/>
+          </w:tcPr>
+          <w:p>
+            <w:pPr>
+              <w:keepNext/>
+              <w:rPr>
+                <w:lang w:val="en-US"/>
+              </w:rPr>
+            </w:pPr>
+            <w:r>
+              <w:rPr>
+                <w:lang w:val="en-US"/>
+              </w:rPr>
+              <w:t>524H0124</w:t>
+            </w:r>
+          </w:p>
+        </w:tc>
+      </w:tr>
+    </w:tbl>
+    <w:p>
+      <w:pPr>
+        <w:keepNext/>
+        <w:rPr>
+          <w:lang w:val="en-US"/>
+        </w:rPr>
+      </w:pPr>
+    </w:p>
     <w:p>
       <w:pPr>
         <w:keepNext/>
@@ -89,16 +401,8 @@
         <w:rPr>
           <w:lang w:val="en-US"/>
         </w:rPr>
-        <w:t xml:space="preserve"> Use case </w:t>
-      </w:r>
-      <w:proofErr w:type="spellStart"/>
-      <w:r>
-        <w:rPr>
-          <w:lang w:val="en-US"/>
-        </w:rPr>
-        <w:t>của</w:t>
-      </w:r>
-      <w:proofErr w:type="spellEnd"/>
+        <w:t xml:space="preserve"> Use case của</w:t>
+      </w:r>
       <w:r>
         <w:t xml:space="preserve"> hệ thống</w:t>
       </w:r>
@@ -459,6 +763,9 @@
         <w:keepNext/>
       </w:pPr>
       <w:r>
+        <w:rPr>
+          <w:noProof/>
+        </w:rPr>
         <w:lastRenderedPageBreak/>
         <w:drawing>
           <wp:inline distT="0" distB="0" distL="0" distR="0" wp14:anchorId="56D1EF8B" wp14:editId="652F85DB">
@@ -531,6 +838,9 @@
         <w:keepNext/>
       </w:pPr>
       <w:r>
+        <w:rPr>
+          <w:noProof/>
+        </w:rPr>
         <w:lastRenderedPageBreak/>
         <w:drawing>
           <wp:inline distT="0" distB="0" distL="0" distR="0" wp14:anchorId="1ADEDD8C" wp14:editId="7F6175D8">
@@ -603,6 +913,9 @@
         <w:keepNext/>
       </w:pPr>
       <w:r>
+        <w:rPr>
+          <w:noProof/>
+        </w:rPr>
         <w:lastRenderedPageBreak/>
         <w:drawing>
           <wp:inline distT="0" distB="0" distL="0" distR="0" wp14:anchorId="38C829FD" wp14:editId="09DB099A">
@@ -675,6 +988,9 @@
         <w:keepNext/>
       </w:pPr>
       <w:r>
+        <w:rPr>
+          <w:noProof/>
+        </w:rPr>
         <w:lastRenderedPageBreak/>
         <w:drawing>
           <wp:inline distT="0" distB="0" distL="0" distR="0" wp14:anchorId="0A0F3F2B" wp14:editId="4777635F">
@@ -747,6 +1063,9 @@
         <w:keepNext/>
       </w:pPr>
       <w:r>
+        <w:rPr>
+          <w:noProof/>
+        </w:rPr>
         <w:lastRenderedPageBreak/>
         <w:drawing>
           <wp:inline distT="0" distB="0" distL="0" distR="0" wp14:anchorId="275A977D" wp14:editId="59FDE3D6">
@@ -819,6 +1138,9 @@
         <w:keepNext/>
       </w:pPr>
       <w:r>
+        <w:rPr>
+          <w:noProof/>
+        </w:rPr>
         <w:lastRenderedPageBreak/>
         <w:drawing>
           <wp:inline distT="0" distB="0" distL="0" distR="0" wp14:anchorId="1AF6EEE0" wp14:editId="6B2FCE43">
@@ -1848,6 +2170,25 @@
       <w:szCs w:val="18"/>
     </w:rPr>
   </w:style>
+  <w:style w:type="table" w:styleId="TableGrid">
+    <w:name w:val="Table Grid"/>
+    <w:basedOn w:val="TableNormal"/>
+    <w:uiPriority w:val="39"/>
+    <w:rsid w:val="0059591A"/>
+    <w:pPr>
+      <w:spacing w:after="0" w:line="240" w:lineRule="auto"/>
+    </w:pPr>
+    <w:tblPr>
+      <w:tblBorders>
+        <w:top w:val="single" w:sz="4" w:space="0" w:color="auto"/>
+        <w:left w:val="single" w:sz="4" w:space="0" w:color="auto"/>
+        <w:bottom w:val="single" w:sz="4" w:space="0" w:color="auto"/>
+        <w:right w:val="single" w:sz="4" w:space="0" w:color="auto"/>
+        <w:insideH w:val="single" w:sz="4" w:space="0" w:color="auto"/>
+        <w:insideV w:val="single" w:sz="4" w:space="0" w:color="auto"/>
+      </w:tblBorders>
+    </w:tblPr>
+  </w:style>
 </w:styles>
 </file>
 

</xml_diff>